<commit_message>
More modifications in styling
More modifications in styling
</commit_message>
<xml_diff>
--- a/CBI_Supplementary_Letter_Green_Colored_fonts.docx
+++ b/CBI_Supplementary_Letter_Green_Colored_fonts.docx
@@ -1127,7 +1127,6 @@
     </w:tbl>
     <w:p>
       <w:pPr>
-        <w:spacing w:before="200" w:after="120"/>
         <w:rPr>
           <w:b/>
           <w:bCs/>
@@ -1136,9 +1135,7 @@
           <w:szCs w:val="28"/>
         </w:rPr>
       </w:pPr>
-    </w:p>
-    <w:p>
-      <w:pPr>
+      <w:r>
         <w:rPr>
           <w:b/>
           <w:bCs/>
@@ -1146,16 +1143,6 @@
           <w:sz w:val="28"/>
           <w:szCs w:val="28"/>
         </w:rPr>
-      </w:pPr>
-      <w:r>
-        <w:rPr>
-          <w:b/>
-          <w:bCs/>
-          <w:color w:val="3A7C22" w:themeColor="accent6" w:themeShade="BF"/>
-          <w:sz w:val="28"/>
-          <w:szCs w:val="28"/>
-        </w:rPr>
-        <w:lastRenderedPageBreak/>
         <w:br w:type="page"/>
       </w:r>
     </w:p>
@@ -1476,18 +1463,7 @@
           <w:highlight w:val="yellow"/>
         </w:rPr>
         <w:lastRenderedPageBreak/>
-        <w:t>I</w:t>
-      </w:r>
-      <w:r>
-        <w:rPr>
-          <w:b/>
-          <w:bCs/>
-          <w:color w:val="3A7C22" w:themeColor="accent6" w:themeShade="BF"/>
-          <w:sz w:val="28"/>
-          <w:szCs w:val="28"/>
-          <w:highlight w:val="yellow"/>
-        </w:rPr>
-        <w:t>llustrative diagrams</w:t>
+        <w:t>Illustrative diagrams</w:t>
       </w:r>
       <w:r>
         <w:rPr>

</xml_diff>